<commit_message>
Render headings in plain black to match the parties' contract style
Default Word Title/Heading styles ship with blue color and a horizontal
underline on Title, which doesn't match the existing Голден Дент
contract layout. Override the styles so generated docx files use black,
centered titles without the bottom border, and black bold section
headings.
</commit_message>
<xml_diff>
--- a/ARCHITECTURE.docx
+++ b/ARCHITECTURE.docx
@@ -1848,7 +1848,7 @@
       <w:rFonts w:asciiTheme="majorHAnsi" w:eastAsiaTheme="majorEastAsia" w:hAnsiTheme="majorHAnsi" w:cstheme="majorBidi"/>
       <w:b/>
       <w:bCs/>
-      <w:color w:val="365F91" w:themeColor="accent1" w:themeShade="BF"/>
+      <w:color w:val="000000"/>
       <w:sz w:val="28"/>
       <w:szCs w:val="28"/>
     </w:rPr>
@@ -1872,7 +1872,7 @@
       <w:rFonts w:asciiTheme="majorHAnsi" w:eastAsiaTheme="majorEastAsia" w:hAnsiTheme="majorHAnsi" w:cstheme="majorBidi"/>
       <w:b/>
       <w:bCs/>
-      <w:color w:val="4F81BD" w:themeColor="accent1"/>
+      <w:color w:val="000000"/>
       <w:sz w:val="26"/>
       <w:szCs w:val="26"/>
     </w:rPr>
@@ -1896,7 +1896,7 @@
       <w:rFonts w:asciiTheme="majorHAnsi" w:eastAsiaTheme="majorEastAsia" w:hAnsiTheme="majorHAnsi" w:cstheme="majorBidi"/>
       <w:b/>
       <w:bCs/>
-      <w:color w:val="4F81BD" w:themeColor="accent1"/>
+      <w:color w:val="000000"/>
     </w:rPr>
   </w:style>
   <w:style w:type="paragraph" w:styleId="Heading4">
@@ -1921,7 +1921,7 @@
       <w:bCs/>
       <w:i/>
       <w:iCs/>
-      <w:color w:val="4F81BD" w:themeColor="accent1"/>
+      <w:color w:val="000000"/>
     </w:rPr>
   </w:style>
   <w:style w:type="paragraph" w:styleId="Heading5">
@@ -2127,15 +2127,13 @@
     <w:qFormat/>
     <w:rsid w:val="00FC693F"/>
     <w:pPr>
-      <w:pBdr>
-        <w:bottom w:val="single" w:sz="8" w:space="4" w:color="4F81BD" w:themeColor="accent1"/>
-      </w:pBdr>
       <w:spacing w:after="300" w:line="240" w:lineRule="auto"/>
       <w:contextualSpacing/>
+      <w:jc w:val="center"/>
     </w:pPr>
     <w:rPr>
       <w:rFonts w:asciiTheme="majorHAnsi" w:eastAsiaTheme="majorEastAsia" w:hAnsiTheme="majorHAnsi" w:cstheme="majorBidi"/>
-      <w:color w:val="17365D" w:themeColor="text2" w:themeShade="BF"/>
+      <w:color w:val="000000"/>
       <w:spacing w:val="5"/>
       <w:kern w:val="28"/>
       <w:sz w:val="52"/>

</xml_diff>